<commit_message>
Submission package: draw Fig. 1, build Supplementary Material (Tables S1-S7, Figs. S1-S14), update cover letter to v4.4, submission checklist
Co-Authored-By: Claude Opus 5.5 <noreply@anthropic.com>
Claude-Session: https://claude.ai/code/session_01LGLpDzAMfdMgWcXQjLxauw
</commit_message>
<xml_diff>
--- a/manuscript/v4/word/Cover_Letter_v4.docx
+++ b/manuscript/v4/word/Cover_Letter_v4.docx
@@ -128,7 +128,7 @@
         <w:pStyle w:val="BodyText"/>
       </w:pPr>
       <w:r>
-        <w:t xml:space="preserve">a closed-form catalogue of blind loci for deflection, strain, rotation, shear and reaction channels on two- and three-span and haunched girders, including a near-blind ring for strain gauges set back from the piers;</w:t>
+        <w:t xml:space="preserve">a closed-form catalogue of blind loci for deflection, strain, rotation, shear and reaction channels on two- and three-span and haunched girders, including the near-blind band that can contain strain gauges set back from the piers;</w:t>
       </w:r>
     </w:p>
     <w:p>
@@ -140,7 +140,7 @@
         <w:pStyle w:val="BodyText"/>
       </w:pPr>
       <w:r>
-        <w:t xml:space="preserve">a strain indicator that needs no reference stiffness, a cancellation ratio that separates cancellation from restraint, and a corrected normalisation of the deflection indicator;</w:t>
+        <w:t xml:space="preserve">a strain indicator that needs no reference rigidity, a cancellation ratio that separates cancellation from restraint, and a normalisation of the deflection indicator that makes its threshold explicit;</w:t>
       </w:r>
     </w:p>
     <w:p>
@@ -199,7 +199,7 @@
         <w:pStyle w:val="BodyText"/>
       </w:pPr>
       <w:r>
-        <w:t xml:space="preserve">an identifiability analysis under uncertain pier stiffness, in which the constant follows a Möbius law in one stiffness ratio, and which names the measurement that resolves it;</w:t>
+        <w:t xml:space="preserve">an identifiability analysis under uncertain pier stiffness, in which the constant follows a Möbius law in the scaled pier stiffness, and which names the measurement that resolves it;</w:t>
       </w:r>
     </w:p>
     <w:p>
@@ -219,7 +219,7 @@
         <w:pStyle w:val="FirstParagraph"/>
       </w:pPr>
       <w:r>
-        <w:t xml:space="preserve">The field assessment reports every channel with 95 % confidence intervals and equivalence tests, and it reports negative results. The reference weights on these records vary so little that predicting the mean weight beats every estimator, so the records cannot test weight discrimination. Constants are consistent with axle-configuration invariance but the test is inconclusive at better than about 27 %. Generalised least squares with the measured noise covariance did worse out of sample than the plain gauge average, because errors during crossings are much less correlated between gauges than vehicle-free noise; we present this as a design caution for offset-immune estimation. An application to an in-service 55 + 90 + 55 m box girder shows that its side-span deflection gauge is not identifiable from static acceptance data, and predicts the measurements that would decide.</w:t>
+        <w:t xml:space="preserve">The field assessment reports its results with 95 % confidence intervals and equivalence tests (per-channel tables in the Supplementary Material), and it reports negative results. The reference weights on these records vary so little that predicting the mean weight beats every estimator, so the records cannot test weight discrimination. Constants are consistent with axle-configuration invariance, but the test cannot resolve differences smaller than about 27 %. Generalised least squares with the measured noise covariance performed worse out of sample than the gauge average, because crossing residuals are much less correlated between gauges than vehicle-free noise; we present this as a design caution for zero-sum (offset-immune) estimation. An application to an in-service 55 + 90 + 55 m box girder shows that its side-span deflection gauge is not identifiable from static acceptance data, and predicts the measurements that would decide.</w:t>
       </w:r>
     </w:p>
     <w:p>
@@ -227,7 +227,7 @@
         <w:pStyle w:val="BodyText"/>
       </w:pPr>
       <w:r>
-        <w:t xml:space="preserve">We believe the paper fits the journal’s interest in sensor placement, identifiability, signal processing and field measurement. The journal has recently published work on deflection influence lines of continuous beam bridges, which we cite and distinguish.</w:t>
+        <w:t xml:space="preserve">We believe the paper fits the journal’s interest in sensor placement, identifiability, signal processing and field measurement. The journal has recently published work on deflection influence lines of continuous beam bridges, which we cite and distinguish, as we do a recent absolute-area weighing method for continuous rigid-frame bridges.</w:t>
       </w:r>
     </w:p>
     <w:p>
@@ -245,7 +245,7 @@
         <w:t xml:space="preserve"> </w:t>
       </w:r>
       <w:r>
-        <w:t xml:space="preserve">The field strain records are from the public NOR-BWIM dataset (figshare, https://doi.org/10.7294/26880898.v1, CC0 licence). The laboratory data, the derived data behind every figure and table, and all analysis scripts with their console output are provided as supplementary material, and the processed in-service bridge data will be deposited at [NEED VALUE: repository name and DOI].</w:t>
+        <w:t xml:space="preserve">The field strain records are from the public NOR-BWIM dataset (figshare, https://doi.org/10.7294/26880898.v1, CC0 licence). The laboratory data, the derived data behind every figure and table, and all analysis scripts with their console output are provided as Supplementary Material, and the processed in-service bridge data will be deposited at [NEED VALUE: repository name and DOI].</w:t>
       </w:r>
     </w:p>
     <w:p>

</xml_diff>

<commit_message>
Fill all author values (M1 weights, Mitutoyo dial gauges on ground frames, 4.6 % GVW of dataset authors, data in Supplementary Tables S8-S10, Q.-B. Nguyen test role, funding, acknowledgements, no overlap with Structures papers); Fig. 1 with EI labels; Fig. S15
Co-Authored-By: Claude Opus 5.5 <noreply@anthropic.com>
Claude-Session: https://claude.ai/code/session_01LGLpDzAMfdMgWcXQjLxauw
</commit_message>
<xml_diff>
--- a/manuscript/v4/word/Cover_Letter_v4.docx
+++ b/manuscript/v4/word/Cover_Letter_v4.docx
@@ -7,7 +7,7 @@
         <w:pStyle w:val="FirstParagraph"/>
       </w:pPr>
       <w:r>
-        <w:t xml:space="preserve">[NEED VALUE: date]</w:t>
+        <w:t xml:space="preserve">[date of submission]</w:t>
       </w:r>
     </w:p>
     <w:p>
@@ -245,7 +245,7 @@
         <w:t xml:space="preserve"> </w:t>
       </w:r>
       <w:r>
-        <w:t xml:space="preserve">The field strain records are from the public NOR-BWIM dataset (figshare, https://doi.org/10.7294/26880898.v1, CC0 licence). The laboratory data, the derived data behind every figure and table, and all analysis scripts with their console output are provided as Supplementary Material, and the processed in-service bridge data will be deposited at [NEED VALUE: repository name and DOI].</w:t>
+        <w:t xml:space="preserve">The field strain records are from the public NOR-BWIM dataset (figshare, https://doi.org/10.7294/26880898.v1, CC0 licence). The laboratory data, the derived data behind every figure and table, and all analysis scripts with their console output are provided as Supplementary Material, as are the processed data of the in-service bridge.</w:t>
       </w:r>
     </w:p>
     <w:p>
@@ -253,7 +253,7 @@
         <w:pStyle w:val="BodyText"/>
       </w:pPr>
       <w:r>
-        <w:t xml:space="preserve">The manuscript is original, has not been published, and is not under consideration by any other journal. [NEED VALUE: two related papers by the authors are under review at</w:t>
+        <w:t xml:space="preserve">The manuscript is original, has not been published, and is not under consideration by any other journal. Two other papers by the authors are under review at</w:t>
       </w:r>
       <w:r>
         <w:t xml:space="preserve"> </w:t>
@@ -266,7 +266,7 @@
         <w:t xml:space="preserve">Structures</w:t>
       </w:r>
       <w:r>
-        <w:t xml:space="preserve">; state here whether they share the laboratory rig, data or text with this manuscript and how they are cited, or confirm that there is no overlap, and attach them as papers for the editor.] All authors have approved the submission. Conflicts of interest, funding and the use of generative AI are declared in the manuscript.</w:t>
+        <w:t xml:space="preserve">; they address different problems and share no data, test rig or text with this manuscript. All authors have approved the submission. Conflicts of interest, funding and the use of generative AI are declared in the manuscript.</w:t>
       </w:r>
     </w:p>
     <w:p>

</xml_diff>